<commit_message>
Revise topic 1 draft per the user's revision brief
Adds the subtitle, fixes the 躺平 timeline in the introduction, expands
the 潘晓 media comparison, the 仰卧起坐式躺平 psychology and the 话语方式
and recommendation-switch passages, and cites all seven sources in
footnotes. Other passages are tightened so the paper stays within
3650-3900 characters, or under 4000 counting footnotes. Section 4(3) is
folded into 5's second point, which now makes the same argument.
Footnotes now number continuously (①-⑦) instead of restarting on each page.

Co-Authored-By: Claude Opus 5.5 <noreply@anthropic.com>
Claude-Session: https://claude.ai/code/session_01MTbT5STBW9BR6icDrytRQm
</commit_message>
<xml_diff>
--- a/paper/移动互联网时代社会思潮的传播及其影响（初稿）.docx
+++ b/paper/移动互联网时代社会思潮的传播及其影响（初稿）.docx
@@ -18,6 +18,20 @@
     </w:p>
     <w:p>
       <w:pPr>
+        <w:spacing w:after="120" w:line="360" w:lineRule="auto"/>
+        <w:jc w:val="center"/>
+      </w:pPr>
+      <w:r>
+        <w:rPr>
+          <w:rFonts w:ascii="Times New Roman" w:cs="Times New Roman" w:eastAsia="楷体" w:hAnsi="Times New Roman" w:hint="eastAsia"/>
+          <w:sz w:val="28"/>
+          <w:szCs w:val="28"/>
+        </w:rPr>
+        <w:t xml:space="preserve">——以青年“躺平”话语的符号化流变为例</w:t>
+      </w:r>
+    </w:p>
+    <w:p>
+      <w:pPr>
         <w:spacing w:after="240" w:line="360" w:lineRule="auto"/>
         <w:jc w:val="center"/>
       </w:pPr>
@@ -57,22 +71,22 @@
           <w:sz w:val="24"/>
           <w:szCs w:val="24"/>
         </w:rPr>
-        <w:t xml:space="preserve">“不卷了，躺平了。”每到期末周，或者实习投递石沉大海之后，我们宿舍里总会有人冒出这句话。说这话的人，第二天多半还是会准时去图书馆占座，但“躺平”这个词，已经成了我们这一代年轻人表达疲惫、自嘲和无奈的通用语言。我第一次听到它是在高中，那时它还只是短视频评论区里的一个新鲜说法；短短几年间，它从网络论坛上的一篇帖子出发，进入表情包、短视频和新闻评论，甚至出现在国家领导人关于共同富裕的重要论述之中。</w:t>
-      </w:r>
-    </w:p>
-    <w:p>
-      <w:pPr>
-        <w:spacing w:line="360" w:lineRule="auto"/>
-        <w:ind w:firstLine="480"/>
-        <w:jc w:val="both"/>
-      </w:pPr>
-      <w:r>
-        <w:rPr>
-          <w:rFonts w:ascii="Times New Roman" w:cs="Times New Roman" w:eastAsia="宋体" w:hAnsi="Times New Roman" w:hint="eastAsia"/>
-          <w:sz w:val="24"/>
-          <w:szCs w:val="24"/>
-        </w:rPr>
-        <w:t xml:space="preserve">一个词能在如此短的时间里传遍全国，离不开移动互联网提供的传播条件。中国互联网络信息中心发布的报告显示，截至2025年12月，我国网民规模达11.25亿人，其中手机网民规模达11.21亿人，网民使用手机上网的比例高达99.6%。</w:t>
+        <w:t xml:space="preserve">“不卷了，躺平了。”每到期末周，或者实习投递石沉大海之后，我们宿舍里总会有人冒出这句话，而说这话的人，第二天多半还是会准时去图书馆占座。我第一次听到“躺平”是在高中，那时它还只是短视频评论区里的一个新鲜说法。回溯源头，它从2021年春天网络论坛上的一篇帖子出发，短短几个月内就演变为席卷全网的表情包与短视频热梗，并在同年进入了国家领导人关于共同富裕的重要论述；此后几年，它更沉淀为我们日常随口而出的口头禅。</w:t>
+      </w:r>
+    </w:p>
+    <w:p>
+      <w:pPr>
+        <w:spacing w:line="360" w:lineRule="auto"/>
+        <w:ind w:firstLine="480"/>
+        <w:jc w:val="both"/>
+      </w:pPr>
+      <w:r>
+        <w:rPr>
+          <w:rFonts w:ascii="Times New Roman" w:cs="Times New Roman" w:eastAsia="宋体" w:hAnsi="Times New Roman" w:hint="eastAsia"/>
+          <w:sz w:val="24"/>
+          <w:szCs w:val="24"/>
+        </w:rPr>
+        <w:t xml:space="preserve">一个词能这么快传遍全国，离不开移动互联网。中国互联网络信息中心的报告显示，截至2025年12月，我国网民规模达11.25亿人，网民使用手机上网的比例高达99.6%。</w:t>
       </w:r>
       <w:r>
         <w:rPr>
@@ -86,7 +100,7 @@
           <w:sz w:val="24"/>
           <w:szCs w:val="24"/>
         </w:rPr>
-        <w:t xml:space="preserve">当几乎每个人手里都握着一块可以随时发布、转发和评论的屏幕，社会思潮的生成与传播方式也随之发生了深刻变化。本文以“躺平”为例，考察一种青年社会思潮如何借助移动互联网迅速扩散，分析它带来的多重影响，并尝试提出相应的引导思路。</w:t>
+        <w:t xml:space="preserve">当几乎每个人都握着一块能随时发布、转发和评论的屏幕，社会思潮的传播方式也随之改变。本文以“躺平”为例，考察一种青年社会思潮如何借助移动互联网扩散、变形，分析它的影响，并尝试提出回应的思路。</w:t>
       </w:r>
     </w:p>
     <w:p>
@@ -116,37 +130,43 @@
           <w:sz w:val="24"/>
           <w:szCs w:val="24"/>
         </w:rPr>
-        <w:t xml:space="preserve">2021年4月，一位网名为“好心的旅行家”的网友在百度贴吧发布了一篇题为《躺平即是正义》的帖子，自述长期不找固定工作，把物质欲望降到最低，并宣称“躺平就是我的智者运动”。帖子很快被转发到各大社交平台，“躺平”一词在当年5月下旬迅速走红，年底入选《咬文嚼字》杂志评选的“2021年十大流行语”。</w:t>
-      </w:r>
-    </w:p>
-    <w:p>
-      <w:pPr>
-        <w:spacing w:line="360" w:lineRule="auto"/>
-        <w:ind w:firstLine="480"/>
-        <w:jc w:val="both"/>
-      </w:pPr>
-      <w:r>
-        <w:rPr>
-          <w:rFonts w:ascii="Times New Roman" w:cs="Times New Roman" w:eastAsia="宋体" w:hAnsi="Times New Roman" w:hint="eastAsia"/>
-          <w:sz w:val="24"/>
-          <w:szCs w:val="24"/>
-        </w:rPr>
-        <w:t xml:space="preserve">“躺平”并不是凭空出现的。往前追溯，2016年前后流行的“葛优躺”和“丧文化”，2017年前后走红的“佛系”，以及2020年刷屏的“内卷”，都可以看作它的前身或背景；往后延伸，又出现了“摆烂”“45度人生”（卷又卷不赢，躺又躺不平）等变体。这一系列流行语一脉相承，共同表达了部分青年在激烈竞争和生活压力面前的倦怠情绪。</w:t>
-      </w:r>
-    </w:p>
-    <w:p>
-      <w:pPr>
-        <w:spacing w:line="360" w:lineRule="auto"/>
-        <w:ind w:firstLine="480"/>
-        <w:jc w:val="both"/>
-      </w:pPr>
-      <w:r>
-        <w:rPr>
-          <w:rFonts w:ascii="Times New Roman" w:cs="Times New Roman" w:eastAsia="宋体" w:hAnsi="Times New Roman" w:hint="eastAsia"/>
-          <w:sz w:val="24"/>
-          <w:szCs w:val="24"/>
-        </w:rPr>
-        <w:t xml:space="preserve">之所以说“躺平”不只是一个流行语，而是一种社会思潮，是因为它具备社会思潮的几个基本特征：第一，它有明确的价值主张，即降低物质欲望、拒绝过度竞争、不再把世俗意义上的“成功”当作人生的唯一目标；第二，它有现实的社会基础，与就业压力加大、生活成本上升、竞争日趋“内卷”等问题密切相关；第三，它有广泛的群众基础，在相当数量的青年中引起共鸣，并对他们的生活态度产生了实际影响。当然，与历史上那些有系统理论支撑的社会思潮相比，“躺平”更多表现为一种情绪化、碎片化的态度表达，而这恰恰与它的传播方式密切相关。</w:t>
+        <w:t xml:space="preserve">2021年4月，一位网名为“好心的旅行家”的网友在百度贴吧发布了一篇题为《躺平即是正义》的帖子，自述长期不找固定工作，把物质欲望降到最低，并宣称“躺平就是我的智者运动”。帖子很快被转发到各大社交平台，“躺平”在当年5月下旬迅速走红，年底入选《咬文嚼字》杂志评选的“2021年十大流行语”。</w:t>
+      </w:r>
+      <w:r>
+        <w:rPr>
+          <w:rStyle w:val="FootnoteReference"/>
+        </w:rPr>
+        <w:footnoteReference w:id="2"/>
+      </w:r>
+    </w:p>
+    <w:p>
+      <w:pPr>
+        <w:spacing w:line="360" w:lineRule="auto"/>
+        <w:ind w:firstLine="480"/>
+        <w:jc w:val="both"/>
+      </w:pPr>
+      <w:r>
+        <w:rPr>
+          <w:rFonts w:ascii="Times New Roman" w:cs="Times New Roman" w:eastAsia="宋体" w:hAnsi="Times New Roman" w:hint="eastAsia"/>
+          <w:sz w:val="24"/>
+          <w:szCs w:val="24"/>
+        </w:rPr>
+        <w:t xml:space="preserve">“躺平”并不是凭空出现的。往前追溯，2016年前后流行的“葛优躺”和“丧文化”，2017年前后走红的“佛系”，以及2020年刷屏的“内卷”，都可以看作它的前身或背景；往后延伸，又出现了“摆烂”“45度人生”（卷又卷不赢，躺又躺不平）等变体。这一串流行语一脉相承，表达的都是部分青年在竞争和压力面前的倦怠。</w:t>
+      </w:r>
+    </w:p>
+    <w:p>
+      <w:pPr>
+        <w:spacing w:line="360" w:lineRule="auto"/>
+        <w:ind w:firstLine="480"/>
+        <w:jc w:val="both"/>
+      </w:pPr>
+      <w:r>
+        <w:rPr>
+          <w:rFonts w:ascii="Times New Roman" w:cs="Times New Roman" w:eastAsia="宋体" w:hAnsi="Times New Roman" w:hint="eastAsia"/>
+          <w:sz w:val="24"/>
+          <w:szCs w:val="24"/>
+        </w:rPr>
+        <w:t xml:space="preserve">之所以说“躺平”不只是一个流行语，而是一种社会思潮，是因为它具备社会思潮的基本特征：第一，它有明确的价值主张，即降低物质欲望、拒绝过度竞争、不再把“成功”当作人生的唯一目标；第二，它有现实的社会基础，与就业压力、生活成本和“内卷”式竞争密切相关；第三，它有广泛的群众基础，在不少青年中引起共鸣，影响着他们的生活态度。当然，与那些有系统理论支撑的社会思潮相比，“躺平”更多是一种情绪化、碎片化的态度表达，而这恰恰与它的传播方式密切相关。</w:t>
       </w:r>
     </w:p>
     <w:p>
@@ -176,7 +196,36 @@
           <w:sz w:val="24"/>
           <w:szCs w:val="24"/>
         </w:rPr>
-        <w:t xml:space="preserve">1980年，《中国青年》杂志第5期刊发了署名“潘晓”的读者来信《人生的路呵，怎么越走越窄……》，引发了一场持续半年之久的全国性人生观大讨论。那场讨论依托的是纸质刊物，青年们提笔写信、等待刊发，观点以长篇书信的形式往来交锋。四十年后，同样是关于“人该怎样活”的追问，“躺平”的传播却呈现出完全不同的面貌。</w:t>
+        <w:t xml:space="preserve">1980年，《中国青年》杂志第5期刊发了署名“潘晓”的读者来信《人生的路呵，怎么越走越窄……》</w:t>
+      </w:r>
+      <w:r>
+        <w:rPr>
+          <w:rStyle w:val="FootnoteReference"/>
+        </w:rPr>
+        <w:footnoteReference w:id="3"/>
+      </w:r>
+      <w:r>
+        <w:rPr>
+          <w:rFonts w:ascii="Times New Roman" w:cs="Times New Roman" w:eastAsia="宋体" w:hAnsi="Times New Roman" w:hint="eastAsia"/>
+          <w:sz w:val="24"/>
+          <w:szCs w:val="24"/>
+        </w:rPr>
+        <w:t xml:space="preserve">，引发了一场持续半年的全国性人生观大讨论。那是一个靠纸张传递思想的年代：读者要静下心来读完数千字的长信，在书桌前反复思量，再提笔写信、贴上邮票寄往编辑部，往往要等上很久，才能看到不同观点的交锋。讨论的节奏是慢的，门槛也不低，但它完成的是一场严肃的公共说理。</w:t>
+      </w:r>
+    </w:p>
+    <w:p>
+      <w:pPr>
+        <w:spacing w:line="360" w:lineRule="auto"/>
+        <w:ind w:firstLine="480"/>
+        <w:jc w:val="both"/>
+      </w:pPr>
+      <w:r>
+        <w:rPr>
+          <w:rFonts w:ascii="Times New Roman" w:cs="Times New Roman" w:eastAsia="宋体" w:hAnsi="Times New Roman" w:hint="eastAsia"/>
+          <w:sz w:val="24"/>
+          <w:szCs w:val="24"/>
+        </w:rPr>
+        <w:t xml:space="preserve">四十年后，同样是关于“人该怎样活”的追问，“躺平”的传播却完全换了一副面貌。我们接触这个话题，往往是在挤地铁的通勤路上、食堂排队的间隙，或者睡前刷手机的十几分钟里。这种随时随地、断断续续的指尖浅阅读，很难容纳长篇大论的逻辑推演，一种思潮要想被看见，就必须从“文本阅读”转向“视觉消费”和“即时互动”。</w:t>
       </w:r>
     </w:p>
     <w:p>
@@ -209,7 +258,7 @@
           <w:sz w:val="24"/>
           <w:szCs w:val="24"/>
         </w:rPr>
-        <w:t xml:space="preserve">“躺平”的原帖本身带有一定的思辨色彩，作者甚至借用了古希腊“智者运动”的说法为自己辩护。但在传播过程中，真正流行开来的并不是这些论证，而是“躺平”两个字本身，以及与之配套的表情包和短视频：一只四脚朝天的猫、一张瘫在沙发上的截图、一句“家人们，我躺平了”，就足以完成一次表态。我的手机里至今还存着十几张“躺平”表情包，用它们回复消息，比打一段字省事得多。符号化极大地降低了社会思潮的传播门槛，人们不需要理解一种观点的来龙去脉，只要转发一个符号就能“加入”其中；但与此同时，原本可以展开讨论的复杂问题，也被压缩成了一种无须论证的态度。</w:t>
+        <w:t xml:space="preserve">“躺平”的原帖本身带有一定的思辨色彩，但真正流行开来的并不是其中的论证，而是“躺平”两个字本身，以及与之配套的表情包和短视频：一只四脚朝天的猫、一张瘫在沙发上的截图、一句“家人们，我躺平了”，就足以完成一次表态。我的手机里至今还存着十几张“躺平”表情包，用它们回复消息，比打一段字省事得多。符号化大大降低了思潮传播的门槛，人们不需要弄懂一种观点的来龙去脉，转发一个符号就算“加入”了；可与此同时，本该展开讨论的复杂问题，也被压缩成了一种无须论证的态度。</w:t>
       </w:r>
     </w:p>
     <w:p>
@@ -242,21 +291,21 @@
           <w:sz w:val="24"/>
           <w:szCs w:val="24"/>
         </w:rPr>
-        <w:t xml:space="preserve">移动互联网平台普遍采用个性化推荐算法，用户的每一次点赞、停留和评论都会被记录下来，并决定他接下来会看到什么。有一段时间，我连续刷到几条“裸辞去大理躺平”的视频，多看了几眼之后，首页很快就被类似内容占满，仿佛身边所有人都在辞职、都在躺平。美国学者桑斯坦曾用“信息茧房”来形容人们只接触自己选择的、令自己愉悦的信息的状态。</w:t>
-      </w:r>
-      <w:r>
-        <w:rPr>
-          <w:rStyle w:val="FootnoteReference"/>
-        </w:rPr>
-        <w:footnoteReference w:id="2"/>
-      </w:r>
-      <w:r>
-        <w:rPr>
-          <w:rFonts w:ascii="Times New Roman" w:cs="Times New Roman" w:eastAsia="宋体" w:hAnsi="Times New Roman" w:hint="eastAsia"/>
-          <w:sz w:val="24"/>
-          <w:szCs w:val="24"/>
-        </w:rPr>
-        <w:t xml:space="preserve">算法推荐在很大程度上强化了这种效应：它不断推送与用户既有情绪相契合的内容，使认同“躺平”的人越看越认同，反感“躺平”的人越看越反感，不同观点之间真正的对话反而越来越少。</w:t>
+        <w:t xml:space="preserve">短视频平台普遍采用个性化推荐，用户的每一次点赞、停留和评论，都会决定他接下来看到什么。有一段时间，我连续刷到几条“裸辞去大理躺平”的视频，多看了几眼，首页很快就被类似内容占满，仿佛身边所有人都在辞职、都在躺平。美国学者桑斯坦曾用“信息茧房”来形容人们只接触自己选择的、令自己愉悦的信息的状态。</w:t>
+      </w:r>
+      <w:r>
+        <w:rPr>
+          <w:rStyle w:val="FootnoteReference"/>
+        </w:rPr>
+        <w:footnoteReference w:id="4"/>
+      </w:r>
+      <w:r>
+        <w:rPr>
+          <w:rFonts w:ascii="Times New Roman" w:cs="Times New Roman" w:eastAsia="宋体" w:hAnsi="Times New Roman" w:hint="eastAsia"/>
+          <w:sz w:val="24"/>
+          <w:szCs w:val="24"/>
+        </w:rPr>
+        <w:t xml:space="preserve">算法推荐强化了这种效应：认同“躺平”的人越看越认同，反感“躺平”的人越看越反感，不同观点之间真正的对话反而越来越少。</w:t>
       </w:r>
     </w:p>
     <w:p>
@@ -289,7 +338,7 @@
           <w:sz w:val="24"/>
           <w:szCs w:val="24"/>
         </w:rPr>
-        <w:t xml:space="preserve">在短视频和评论区里，一条内容能否“出圈”，往往不取决于它的道理讲得多透彻，而取决于它能否击中观众的情绪。“躺平”之所以能迅速扩散，很大程度上是因为它说出了许多年轻人想说却说不出的感受。翻看相关视频的评论区，点赞最多的通常是“说的就是我”“破防了”这类情绪表达，而不是对问题的冷静分析。情绪传播速度快、感染力强，却也容易走向极端：在一些平台上，“躺平”与“奋斗”之争常常演变为相互贴标签的骂战，一方被指“不求上进”，另一方被讽为“卷王”，问题本身反而被搁置了。</w:t>
+        <w:t xml:space="preserve">在短视频里，一条内容能否“出圈”，往往不看道理讲得多透彻，而看它能否击中情绪。翻看“躺平”相关视频的评论区，点赞最多的通常是“说的就是我”“破防了”这类情绪表达，而不是对问题的冷静分析。情绪传播快、感染力强，却也容易走向极端：“躺平”与“奋斗”之争常常演变成相互贴标签的骂战，一方被指“不求上进”，另一方被讽为“卷王”，问题本身反倒被搁置了。</w:t>
       </w:r>
     </w:p>
     <w:p>
@@ -337,13 +386,28 @@
           <w:sz w:val="24"/>
           <w:szCs w:val="24"/>
         </w:rPr>
-        <w:t xml:space="preserve">首先，“躺平”为青年提供了一种表达压力和疲惫的话语。很多人嘴上说“躺平”，其实是一种自嘲式的减压：说出来，心里就轻松一些，然后继续生活。其次，“躺平”像一面镜子，折射出就业、住房、教育等领域真实存在的问题，提醒全社会关注年轻人的处境。习近平总书记在《扎实推动共同富裕》一文中指出：“要防止社会阶层固化，畅通向上流动通道，给更多人创造致富机会，形成人人参与的发展环境，避免‘内卷’、‘躺平’。”</w:t>
-      </w:r>
-      <w:r>
-        <w:rPr>
-          <w:rStyle w:val="FootnoteReference"/>
-        </w:rPr>
-        <w:footnoteReference w:id="3"/>
+        <w:t xml:space="preserve">首先，“躺平”给了青年一种表达压力和疲惫的话语。回想我们宿舍，嘴上喊着“躺平”，第二天照样去图书馆占座，这种网友所说的“仰卧起坐式躺平”看似言行不一，背后其实有两层真实的心理。一层是自我保护。面对绩点排名、考研和秋招春招，先把“我躺平了”挂在嘴边，等于提前把期望调低，有点像心理学上说的“防御性悲观”：万一考砸了、简历被刷了，一句“反正早就躺平了”就能缓冲挫败感，保住一点自尊。另一层是同辈之间的相处之道。在竞争激烈的校园里，如果有人总是绷得很紧，逢人就说“我在拼命”，反而会让室友和同学感到压力和疏离；大家一起自嘲“躺平”，倒像一句接头暗号，彼此确认“我们都在同一条船上”，成了一种温和的社交货币。</w:t>
+      </w:r>
+    </w:p>
+    <w:p>
+      <w:pPr>
+        <w:spacing w:line="360" w:lineRule="auto"/>
+        <w:ind w:firstLine="480"/>
+        <w:jc w:val="both"/>
+      </w:pPr>
+      <w:r>
+        <w:rPr>
+          <w:rFonts w:ascii="Times New Roman" w:cs="Times New Roman" w:eastAsia="宋体" w:hAnsi="Times New Roman" w:hint="eastAsia"/>
+          <w:sz w:val="24"/>
+          <w:szCs w:val="24"/>
+        </w:rPr>
+        <w:t xml:space="preserve">其次，“躺平”像一面镜子，折射出就业、住房、教育等领域真实存在的问题，提醒社会关注年轻人的处境。习近平总书记在《扎实推动共同富裕》一文中指出：“要防止社会阶层固化，畅通向上流动通道，给更多人创造致富机会，形成人人参与的发展环境，避免‘内卷’、‘躺平’。”</w:t>
+      </w:r>
+      <w:r>
+        <w:rPr>
+          <w:rStyle w:val="FootnoteReference"/>
+        </w:rPr>
+        <w:footnoteReference w:id="5"/>
       </w:r>
       <w:r>
         <w:rPr>
@@ -384,22 +448,22 @@
           <w:sz w:val="24"/>
           <w:szCs w:val="24"/>
         </w:rPr>
-        <w:t xml:space="preserve">一是从“自嘲”滑向“自弃”。对多数人来说，“躺平”只是一句口头禅，但也有少数人把它当成了放弃努力的理由。我身边就有同学在考研复习遇到瓶颈后，用“反正也卷不过，不如躺平”来安慰自己，最终中途放弃。当“躺平”从一种情绪宣泄变成一种行动选择，它就可能消解个体的奋斗意志，使人陷入消极和迷茫。</w:t>
-      </w:r>
-    </w:p>
-    <w:p>
-      <w:pPr>
-        <w:spacing w:line="360" w:lineRule="auto"/>
-        <w:ind w:firstLine="480"/>
-        <w:jc w:val="both"/>
-      </w:pPr>
-      <w:r>
-        <w:rPr>
-          <w:rFonts w:ascii="Times New Roman" w:cs="Times New Roman" w:eastAsia="宋体" w:hAnsi="Times New Roman" w:hint="eastAsia"/>
-          <w:sz w:val="24"/>
-          <w:szCs w:val="24"/>
-        </w:rPr>
-        <w:t xml:space="preserve">二是遮蔽了问题的结构性根源。“躺平”把就业难、竞争激烈等社会问题，转化成了个人“躺还是不躺”的态度选择，仿佛只要自己想开了、放下了，问题就不存在了。但问题并不会因为个人躺平而消失，反而可能让人放弃通过正当途径表达诉求、推动改变的努力。</w:t>
+        <w:t xml:space="preserve">一是从“自嘲”滑向“自弃”。但也有人真把“躺平”当成了放弃努力的理由。我身边就有同学在考研复习遇到瓶颈后，用“反正也卷不过，不如躺平”来安慰自己，最终中途放弃。当“躺平”从情绪宣泄变成行动选择，它就可能消解个人的奋斗意志，让人陷入消极和迷茫。</w:t>
+      </w:r>
+    </w:p>
+    <w:p>
+      <w:pPr>
+        <w:spacing w:line="360" w:lineRule="auto"/>
+        <w:ind w:firstLine="480"/>
+        <w:jc w:val="both"/>
+      </w:pPr>
+      <w:r>
+        <w:rPr>
+          <w:rFonts w:ascii="Times New Roman" w:cs="Times New Roman" w:eastAsia="宋体" w:hAnsi="Times New Roman" w:hint="eastAsia"/>
+          <w:sz w:val="24"/>
+          <w:szCs w:val="24"/>
+        </w:rPr>
+        <w:t xml:space="preserve">二是遮蔽了问题的结构性根源。“躺平”把就业难、竞争激烈等社会问题，变成了个人“躺还是不躺”的态度选择。可问题不会因为个人躺平而消失，反而可能让人放弃通过正当途径表达诉求、推动改变的努力。</w:t>
       </w:r>
     </w:p>
     <w:p>
@@ -420,48 +484,15 @@
         <w:rPr>
           <w:rStyle w:val="FootnoteReference"/>
         </w:rPr>
-        <w:footnoteReference w:id="4"/>
-      </w:r>
-      <w:r>
-        <w:rPr>
-          <w:rFonts w:ascii="Times New Roman" w:cs="Times New Roman" w:eastAsia="宋体" w:hAnsi="Times New Roman" w:hint="eastAsia"/>
-          <w:sz w:val="24"/>
-          <w:szCs w:val="24"/>
-        </w:rPr>
-        <w:t xml:space="preserve">“躺平”同样如此：它走红后不久，电商平台上就一度出现了印着“躺平”字样的T恤、手机壳等商品。一种主张“少消费、低欲望”的态度，最终却被做成了可以买卖的商品，这本身就颇具讽刺意味。</w:t>
-      </w:r>
-    </w:p>
-    <w:p>
-      <w:pPr>
-        <w:keepNext/>
-        <w:spacing w:line="360" w:lineRule="auto"/>
-        <w:ind w:firstLine="480"/>
-        <w:outlineLvl w:val="1"/>
-      </w:pPr>
-      <w:r>
-        <w:rPr>
-          <w:rFonts w:ascii="Times New Roman" w:cs="Times New Roman" w:eastAsia="宋体" w:hAnsi="Times New Roman" w:hint="eastAsia"/>
-          <w:b/>
-          <w:bCs/>
-          <w:sz w:val="24"/>
-          <w:szCs w:val="24"/>
-        </w:rPr>
-        <w:t xml:space="preserve">（三）对主流价值引导提出新课题</w:t>
-      </w:r>
-    </w:p>
-    <w:p>
-      <w:pPr>
-        <w:spacing w:line="360" w:lineRule="auto"/>
-        <w:ind w:firstLine="480"/>
-        <w:jc w:val="both"/>
-      </w:pPr>
-      <w:r>
-        <w:rPr>
-          <w:rFonts w:ascii="Times New Roman" w:cs="Times New Roman" w:eastAsia="宋体" w:hAnsi="Times New Roman" w:hint="eastAsia"/>
-          <w:sz w:val="24"/>
-          <w:szCs w:val="24"/>
-        </w:rPr>
-        <w:t xml:space="preserve">“躺平”走红后，有媒体发表评论，用“可耻”“毒鸡汤”等字眼对其进行严厉批评，这些评论在网络上引发了不小的争议。这提醒我们，在移动互联网时代，居高临下的说教很难真正走进年轻人的内心。思潮传播的主动权已经部分转移到每一个普通用户手中，主流价值的引导既要有立场，也要有温度；既要指出“躺平”的消极之处，也要读懂它背后的真实诉求。</w:t>
+        <w:footnoteReference w:id="6"/>
+      </w:r>
+      <w:r>
+        <w:rPr>
+          <w:rFonts w:ascii="Times New Roman" w:cs="Times New Roman" w:eastAsia="宋体" w:hAnsi="Times New Roman" w:hint="eastAsia"/>
+          <w:sz w:val="24"/>
+          <w:szCs w:val="24"/>
+        </w:rPr>
+        <w:t xml:space="preserve">“躺平”也是如此：它走红后不久，电商平台上就一度出现了印着“躺平”字样的T恤、手机壳等商品。一种主张“少消费、低欲望”的态度，最后却成了可以买卖的商品，颇具讽刺意味。</w:t>
       </w:r>
     </w:p>
     <w:p>
@@ -491,66 +522,66 @@
           <w:sz w:val="24"/>
           <w:szCs w:val="24"/>
         </w:rPr>
-        <w:t xml:space="preserve">第一，解决实际问题是根本。“躺平”情绪的蔓延，根源在于部分青年对未来缺乏确定感和获得感。只有在稳就业、保住房、减轻教育负担等方面持续发力，切实畅通向上流动的通道，年轻人才会真正看到“站起来”的希望。</w:t>
-      </w:r>
-    </w:p>
-    <w:p>
-      <w:pPr>
-        <w:spacing w:line="360" w:lineRule="auto"/>
-        <w:ind w:firstLine="480"/>
-        <w:jc w:val="both"/>
-      </w:pPr>
-      <w:r>
-        <w:rPr>
-          <w:rFonts w:ascii="Times New Roman" w:cs="Times New Roman" w:eastAsia="宋体" w:hAnsi="Times New Roman" w:hint="eastAsia"/>
-          <w:sz w:val="24"/>
-          <w:szCs w:val="24"/>
-        </w:rPr>
-        <w:t xml:space="preserve">第二，改进话语方式是关键。主流媒体和思政教育应当以平视的姿态与青年对话，用年轻人熟悉的语言讲道理，把“躺平还是奋斗”的二元对立，转化为“如何在压力中找到自己的节奏”的讨论。比如，思政课可以围绕“躺平”组织课堂讨论，让同学们说出自己的困惑、彼此辩论，这往往比单向灌输更能引起共鸣。比起简单地告诉年轻人“不许躺”，更重要的是帮助他们看到值得为之努力的目标。</w:t>
-      </w:r>
-    </w:p>
-    <w:p>
-      <w:pPr>
-        <w:spacing w:line="360" w:lineRule="auto"/>
-        <w:ind w:firstLine="480"/>
-        <w:jc w:val="both"/>
-      </w:pPr>
-      <w:r>
-        <w:rPr>
-          <w:rFonts w:ascii="Times New Roman" w:cs="Times New Roman" w:eastAsia="宋体" w:hAnsi="Times New Roman" w:hint="eastAsia"/>
-          <w:sz w:val="24"/>
-          <w:szCs w:val="24"/>
-        </w:rPr>
-        <w:t xml:space="preserve">第三，加强平台治理是保障。2022年3月起施行的《互联网信息服务算法推荐管理规定》明确要求，算法推荐服务提供者应当向用户提供不针对其个人特征的选项，或者提供便捷的关闭算法推荐服务的选项。</w:t>
-      </w:r>
-      <w:r>
-        <w:rPr>
-          <w:rStyle w:val="FootnoteReference"/>
-        </w:rPr>
-        <w:footnoteReference w:id="5"/>
-      </w:r>
-      <w:r>
-        <w:rPr>
-          <w:rFonts w:ascii="Times New Roman" w:cs="Times New Roman" w:eastAsia="宋体" w:hAnsi="Times New Roman" w:hint="eastAsia"/>
-          <w:sz w:val="24"/>
-          <w:szCs w:val="24"/>
-        </w:rPr>
-        <w:t xml:space="preserve">我曾试着在常用的短视频软件里关闭“个性化推荐”，首页内容明显变得丰富多样了。平台不应只是被动地提供一个开关，而应在推荐机制中主动增加内容的多样性，避免用户被困在单一情绪之中。</w:t>
-      </w:r>
-    </w:p>
-    <w:p>
-      <w:pPr>
-        <w:spacing w:line="360" w:lineRule="auto"/>
-        <w:ind w:firstLine="480"/>
-        <w:jc w:val="both"/>
-      </w:pPr>
-      <w:r>
-        <w:rPr>
-          <w:rFonts w:ascii="Times New Roman" w:cs="Times New Roman" w:eastAsia="宋体" w:hAnsi="Times New Roman" w:hint="eastAsia"/>
-          <w:sz w:val="24"/>
-          <w:szCs w:val="24"/>
-        </w:rPr>
-        <w:t xml:space="preserve">第四，青年自身的清醒是基础。我们应当学会区分“暂时躺下休息”和“彻底躺平放弃”：前者是调整节奏、恢复精力，后者则是对自己人生的放弃。在“卷”与“躺”之间，其实还有第三条路，那就是不盲目跟风竞争，也不放弃对美好生活的追求，而是找到自己真正认同的目标，并为之踏实努力。</w:t>
+        <w:t xml:space="preserve">第一，解决实际问题比讲道理更重要。不少年轻人想“躺平”，是因为对未来缺少把握。只有就业机会多一些、住房压力小一些、向上流动的通道更畅通一些，大家才会相信努力是有回报的。</w:t>
+      </w:r>
+    </w:p>
+    <w:p>
+      <w:pPr>
+        <w:spacing w:line="360" w:lineRule="auto"/>
+        <w:ind w:firstLine="480"/>
+        <w:jc w:val="both"/>
+      </w:pPr>
+      <w:r>
+        <w:rPr>
+          <w:rFonts w:ascii="Times New Roman" w:cs="Times New Roman" w:eastAsia="宋体" w:hAnsi="Times New Roman" w:hint="eastAsia"/>
+          <w:sz w:val="24"/>
+          <w:szCs w:val="24"/>
+        </w:rPr>
+        <w:t xml:space="preserve">第二，讲道理的方式也要变一变。“躺平”走红后，有媒体评论用“可耻”“毒鸡汤”等字眼严厉批评，我留意到，这类文章的评论区和弹幕里往往满是逆反式的调侃；而一些高校学者和B站知识区UP主以平视、共情的姿态，结合自身经历聊“允许自己阶段性喘口气”“怎样在压力下保留生活的支点”，评论区里反而涌现出许多真诚的自我剖析和互相打气。可见，只有放下说教的身段，才能重新建立对话的信任。</w:t>
+      </w:r>
+    </w:p>
+    <w:p>
+      <w:pPr>
+        <w:spacing w:line="360" w:lineRule="auto"/>
+        <w:ind w:firstLine="480"/>
+        <w:jc w:val="both"/>
+      </w:pPr>
+      <w:r>
+        <w:rPr>
+          <w:rFonts w:ascii="Times New Roman" w:cs="Times New Roman" w:eastAsia="宋体" w:hAnsi="Times New Roman" w:hint="eastAsia"/>
+          <w:sz w:val="24"/>
+          <w:szCs w:val="24"/>
+        </w:rPr>
+        <w:t xml:space="preserve">第三，平台要把选择权交给用户。2022年3月起施行的《互联网信息服务算法推荐管理规定》明确要求，平台应当向用户提供不针对其个人特征的选项，或者便捷的关闭算法推荐服务的选项。</w:t>
+      </w:r>
+      <w:r>
+        <w:rPr>
+          <w:rStyle w:val="FootnoteReference"/>
+        </w:rPr>
+        <w:footnoteReference w:id="7"/>
+      </w:r>
+      <w:r>
+        <w:rPr>
+          <w:rFonts w:ascii="Times New Roman" w:cs="Times New Roman" w:eastAsia="宋体" w:hAnsi="Times New Roman" w:hint="eastAsia"/>
+          <w:sz w:val="24"/>
+          <w:szCs w:val="24"/>
+        </w:rPr>
+        <w:t xml:space="preserve">我曾试着在常用的短视频软件里关闭“个性化推荐”。关闭之前，首页几乎被渲染考研失败、大厂裁员和鼓吹裸辞隐居的视频占满，很容易让人觉得全世界不是在崩溃就是在躺平；关闭之后，内容杂了一些，我却重新看到了同龄人多样、具体也更坚韧的生活。平台不能只是被动地给一个开关，还应主动让推荐内容更多样，别把用户困在单一的情绪里。</w:t>
+      </w:r>
+    </w:p>
+    <w:p>
+      <w:pPr>
+        <w:spacing w:line="360" w:lineRule="auto"/>
+        <w:ind w:firstLine="480"/>
+        <w:jc w:val="both"/>
+      </w:pPr>
+      <w:r>
+        <w:rPr>
+          <w:rFonts w:ascii="Times New Roman" w:cs="Times New Roman" w:eastAsia="宋体" w:hAnsi="Times New Roman" w:hint="eastAsia"/>
+          <w:sz w:val="24"/>
+          <w:szCs w:val="24"/>
+        </w:rPr>
+        <w:t xml:space="preserve">第四，我们自己也要分清“休息”和“放弃”。暂时躺下，是为了调整节奏、恢复精力；彻底躺平，则是对自己人生的放弃。在“卷”与“躺”之间，其实还有第三条路：不盲目跟风竞争，而是找到自己真正认同的目标，踏踏实实地去做。</w:t>
       </w:r>
     </w:p>
     <w:p>
@@ -580,29 +611,29 @@
           <w:sz w:val="24"/>
           <w:szCs w:val="24"/>
         </w:rPr>
-        <w:t xml:space="preserve">“躺平”从一篇帖子成长为一种广为人知的青年社会思潮，集中体现了移动互联网时代社会思潮传播的新特点：传播内容日益符号化，传播路径受算法深刻塑造，传播动力更多来自情绪共鸣，传播结果还可能被商业力量收编。它的影响是双重的，既是青年释放压力、表达诉求的出口，也可能消解奋斗意志、遮蔽问题根源。</w:t>
-      </w:r>
-    </w:p>
-    <w:p>
-      <w:pPr>
-        <w:spacing w:line="360" w:lineRule="auto"/>
-        <w:ind w:firstLine="480"/>
-        <w:jc w:val="both"/>
-      </w:pPr>
-      <w:r>
-        <w:rPr>
-          <w:rFonts w:ascii="Times New Roman" w:cs="Times New Roman" w:eastAsia="宋体" w:hAnsi="Times New Roman" w:hint="eastAsia"/>
-          <w:sz w:val="24"/>
-          <w:szCs w:val="24"/>
-        </w:rPr>
-        <w:t xml:space="preserve">面对“躺平”这样的网络思潮，简单的否定和放任都不可取。真正需要的，是读懂情绪背后的现实诉求，以解决问题的行动回应年轻人的困惑。年轻人需要的不是一句“不许躺”，而是一个值得站起来的理由。</w:t>
+        <w:t xml:space="preserve">“躺平”从一篇帖子变成一种青年社会思潮，让我们看到移动互联网时代思潮传播的新变化：观点被压缩成符号，算法决定了人们看到什么，情绪比道理跑得更快，反叛的姿态最后还可能被做成商品。它的影响是双重的，既是青年释放压力的出口，也可能消解奋斗意志、遮蔽问题根源。</w:t>
+      </w:r>
+    </w:p>
+    <w:p>
+      <w:pPr>
+        <w:spacing w:line="360" w:lineRule="auto"/>
+        <w:ind w:firstLine="480"/>
+        <w:jc w:val="both"/>
+      </w:pPr>
+      <w:r>
+        <w:rPr>
+          <w:rFonts w:ascii="Times New Roman" w:cs="Times New Roman" w:eastAsia="宋体" w:hAnsi="Times New Roman" w:hint="eastAsia"/>
+          <w:sz w:val="24"/>
+          <w:szCs w:val="24"/>
+        </w:rPr>
+        <w:t xml:space="preserve">面对这样的网络思潮，简单地否定或放任都不可取。真正需要的，是读懂情绪背后的现实诉求，用解决问题的行动回应年轻人的困惑。年轻人需要的不是一句“不许躺”，而是一个值得站起来的理由。</w:t>
       </w:r>
     </w:p>
     <w:sectPr>
       <w:footerReference w:type="default" r:id="rId7"/>
       <w:footnotePr>
         <w:numFmt w:val="decimalEnclosedCircleChinese"/>
-        <w:numRestart w:val="eachPage"/>
+        <w:numRestart w:val="continuous"/>
       </w:footnotePr>
       <w:pgSz w:w="11906" w:h="16838" w:orient="portrait"/>
       <w:pgMar w:top="1440" w:right="1800" w:bottom="1440" w:left="1800" w:header="708" w:footer="708" w:gutter="0"/>
@@ -726,7 +757,7 @@
           <w:sz w:val="18"/>
           <w:szCs w:val="18"/>
         </w:rPr>
-        <w:t xml:space="preserve">中国互联网络信息中心：《第57次中国互联网络发展状况统计报告》，2026年2月。</w:t>
+        <w:t xml:space="preserve">中国互联网络信息中心（CNNIC）：《第57次中国互联网络发展状况统计报告》，2026年2月。</w:t>
       </w:r>
     </w:p>
   </w:footnote>
@@ -747,7 +778,7 @@
           <w:sz w:val="18"/>
           <w:szCs w:val="18"/>
         </w:rPr>
-        <w:t xml:space="preserve">［美］凯斯·R. 桑斯坦：《信息乌托邦：众人如何生产知识》，毕竞悦译，北京：法律出版社，2008年。</w:t>
+        <w:t xml:space="preserve">《〈咬文嚼字〉发布2021十大流行语：赶考、破防等入选》，中国新闻网，2021年12月8日。</w:t>
       </w:r>
     </w:p>
   </w:footnote>
@@ -768,7 +799,7 @@
           <w:sz w:val="18"/>
           <w:szCs w:val="18"/>
         </w:rPr>
-        <w:t xml:space="preserve">习近平：《扎实推动共同富裕》，《求是》2021年第20期。</w:t>
+        <w:t xml:space="preserve">潘晓：《人生的路呵，怎么越走越窄……》，《中国青年》1980年第5期。</w:t>
       </w:r>
     </w:p>
   </w:footnote>
@@ -785,33 +816,57 @@
       </w:r>
       <w:r>
         <w:rPr>
-          <w:rFonts w:ascii="Times New Roman" w:cs="Times New Roman" w:eastAsia="宋体" w:hAnsi="Times New Roman"/>
+          <w:rFonts w:ascii="Times New Roman" w:cs="Times New Roman" w:eastAsia="宋体" w:hAnsi="Times New Roman" w:hint="eastAsia"/>
           <w:sz w:val="18"/>
           <w:szCs w:val="18"/>
         </w:rPr>
-        <w:t xml:space="preserve">Dick Hebdige, </w:t>
-      </w:r>
-      <w:r>
-        <w:rPr>
-          <w:rFonts w:ascii="Times New Roman" w:cs="Times New Roman" w:eastAsia="宋体" w:hAnsi="Times New Roman"/>
-          <w:i/>
-          <w:iCs/>
+        <w:t xml:space="preserve">［美］凯斯·桑斯坦：《信息乌托邦：众人如何生产知识》，毕竞悦译，北京：法律出版社，2008年。</w:t>
+      </w:r>
+    </w:p>
+  </w:footnote>
+  <w:footnote w:id="5">
+    <w:p>
+      <w:pPr>
+        <w:jc w:val="both"/>
+      </w:pPr>
+      <w:r>
+        <w:rPr>
+          <w:rStyle w:val="FootnoteReference"/>
+        </w:rPr>
+        <w:footnoteRef/>
+      </w:r>
+      <w:r>
+        <w:rPr>
+          <w:rFonts w:ascii="Times New Roman" w:cs="Times New Roman" w:eastAsia="宋体" w:hAnsi="Times New Roman" w:hint="eastAsia"/>
           <w:sz w:val="18"/>
           <w:szCs w:val="18"/>
         </w:rPr>
-        <w:t xml:space="preserve">Subculture: The Meaning of Style</w:t>
-      </w:r>
-      <w:r>
-        <w:rPr>
-          <w:rFonts w:ascii="Times New Roman" w:cs="Times New Roman" w:eastAsia="宋体" w:hAnsi="Times New Roman"/>
+        <w:t xml:space="preserve">习近平：《扎实推动共同富裕》，《求是》2021年第20期，第4—8页。</w:t>
+      </w:r>
+    </w:p>
+  </w:footnote>
+  <w:footnote w:id="6">
+    <w:p>
+      <w:pPr>
+        <w:jc w:val="both"/>
+      </w:pPr>
+      <w:r>
+        <w:rPr>
+          <w:rStyle w:val="FootnoteReference"/>
+        </w:rPr>
+        <w:footnoteRef/>
+      </w:r>
+      <w:r>
+        <w:rPr>
+          <w:rFonts w:ascii="Times New Roman" w:cs="Times New Roman" w:eastAsia="宋体" w:hAnsi="Times New Roman" w:hint="eastAsia"/>
           <w:sz w:val="18"/>
           <w:szCs w:val="18"/>
         </w:rPr>
-        <w:t xml:space="preserve">, London: Methuen, 1979.</w:t>
+        <w:t xml:space="preserve">［英］迪克·赫伯迪格：《亚文化：风格的意义》，陆道夫、胡疆锋译，北京：北京大学出版社，2009年。</w:t>
       </w:r>
     </w:p>
   </w:footnote>
-  <w:footnote w:id="5">
+  <w:footnote w:id="7">
     <w:p>
       <w:pPr>
         <w:jc w:val="both"/>
@@ -828,7 +883,7 @@
           <w:sz w:val="18"/>
           <w:szCs w:val="18"/>
         </w:rPr>
-        <w:t xml:space="preserve">国家互联网信息办公室、工业和信息化部、公安部、国家市场监督管理总局：《互联网信息服务算法推荐管理规定》第十七条，2022年3月1日起施行。</w:t>
+        <w:t xml:space="preserve">国家互联网信息办公室、工业和信息化部、公安部、国家市场监督管理总局：《互联网信息服务算法推荐管理规定》，2022年3月1日起施行。</w:t>
       </w:r>
     </w:p>
   </w:footnote>

</xml_diff>

<commit_message>
Polish topic 1 paper per the final revision brief
Brings the body to about 3800 characters (the brief asks for 3700-3900)
by expanding the first-person details: a sticker reply in the dorm group,
the classmate's remark after quitting exam prep, and how the feed felt
before and after turning off personalised recommendations. Restores the
intro timeline wording and adds 保护色 to the peer-pressure point.

Co-Authored-By: Claude Opus 5.5 <noreply@anthropic.com>
Claude-Session: https://claude.ai/code/session_01MTbT5STBW9BR6icDrytRQm
</commit_message>
<xml_diff>
--- a/paper/移动互联网时代社会思潮的传播及其影响（初稿）.docx
+++ b/paper/移动互联网时代社会思潮的传播及其影响（初稿）.docx
@@ -71,7 +71,7 @@
           <w:sz w:val="24"/>
           <w:szCs w:val="24"/>
         </w:rPr>
-        <w:t xml:space="preserve">“不卷了，躺平了。”每到期末周，或者实习投递石沉大海之后，我们宿舍里总会有人冒出这句话，而说这话的人，第二天多半还是会准时去图书馆占座。我第一次听到“躺平”是在高中，那时它还只是短视频评论区里的一个新鲜说法。回溯源头，它从2021年春天网络论坛上的一篇帖子出发，短短几个月内就演变为席卷全网的表情包与短视频热梗，并在同年进入了国家领导人关于共同富裕的重要论述；此后几年，它更沉淀为我们日常随口而出的口头禅。</w:t>
+        <w:t xml:space="preserve">“不卷了，躺平了。”每到期末周，或者实习投递石沉大海之后，我们宿舍里总会有人冒出这句话，而说这话的人，第二天多半还是会准时去图书馆占座。我第一次听到“躺平”是在高中，那时它还只是短视频评论区里的一个新鲜说法。回溯源头，它从2021年春天网络论坛上的一篇帖子出发，短短几个月内就演变为席卷全网的表情包与短视频热梗，并在同年进入了国家领导人关于共同富裕的重要论述之中；此后几年，它更沉淀为我们日常随口而出的口头禅。</w:t>
       </w:r>
     </w:p>
     <w:p>
@@ -258,7 +258,7 @@
           <w:sz w:val="24"/>
           <w:szCs w:val="24"/>
         </w:rPr>
-        <w:t xml:space="preserve">“躺平”的原帖本身带有一定的思辨色彩，但真正流行开来的并不是其中的论证，而是“躺平”两个字本身，以及与之配套的表情包和短视频：一只四脚朝天的猫、一张瘫在沙发上的截图、一句“家人们，我躺平了”，就足以完成一次表态。我的手机里至今还存着十几张“躺平”表情包，用它们回复消息，比打一段字省事得多。符号化大大降低了思潮传播的门槛，人们不需要弄懂一种观点的来龙去脉，转发一个符号就算“加入”了；可与此同时，本该展开讨论的复杂问题，也被压缩成了一种无须论证的态度。</w:t>
+        <w:t xml:space="preserve">“躺平”的原帖本身带有一定的思辨色彩，但真正流行开来的并不是其中的论证，而是“躺平”两个字本身，以及与之配套的表情包和短视频：一只四脚朝天的猫、一张瘫在沙发上的截图、一句“家人们，我躺平了”，就足以完成一次表态。我的手机里至今还存着十几张“躺平”表情包，用它们回复消息，比打一段字省事得多。期末周室友在群里发一句“复习不完了”，我回一张躺平的猫，对方马上就懂，什么都不用多说。符号化大大降低了思潮传播的门槛，人们不需要弄懂一种观点的来龙去脉，转发一个符号就算“加入”了；可与此同时，本该展开讨论的复杂问题，也被压缩成了一种无须论证的态度。</w:t>
       </w:r>
     </w:p>
     <w:p>
@@ -386,7 +386,7 @@
           <w:sz w:val="24"/>
           <w:szCs w:val="24"/>
         </w:rPr>
-        <w:t xml:space="preserve">首先，“躺平”给了青年一种表达压力和疲惫的话语。回想我们宿舍，嘴上喊着“躺平”，第二天照样去图书馆占座，这种网友所说的“仰卧起坐式躺平”看似言行不一，背后其实有两层真实的心理。一层是自我保护。面对绩点排名、考研和秋招春招，先把“我躺平了”挂在嘴边，等于提前把期望调低，有点像心理学上说的“防御性悲观”：万一考砸了、简历被刷了，一句“反正早就躺平了”就能缓冲挫败感，保住一点自尊。另一层是同辈之间的相处之道。在竞争激烈的校园里，如果有人总是绷得很紧，逢人就说“我在拼命”，反而会让室友和同学感到压力和疏离；大家一起自嘲“躺平”，倒像一句接头暗号，彼此确认“我们都在同一条船上”，成了一种温和的社交货币。</w:t>
+        <w:t xml:space="preserve">首先，“躺平”给了青年一种表达压力和疲惫的话语。回想我们宿舍，嘴上喊着“躺平”，第二天照样去图书馆占座，这种网友所说的“仰卧起坐式躺平”看似言行不一，背后其实有两层真实的心理。一层是自我保护。面对绩点排名、考研和秋招春招，先把“我躺平了”挂在嘴边，等于提前把期望调低，有点像心理学上说的“防御性悲观”：万一考砸了、简历被刷了，一句“反正早就躺平了”就能缓冲挫败感，保住一点自尊。另一层是同辈之间的相处之道。在竞争激烈的校园里，如果有人总是绷得很紧，逢人就说“我在拼命”，反而会让室友和同学感到压力和疏离；大家一起自嘲“躺平”，既像给自己涂上一层保护色，又像一句接头暗号，彼此确认“我们都在同一条船上”，成了一种温和的社交货币。</w:t>
       </w:r>
     </w:p>
     <w:p>
@@ -448,7 +448,7 @@
           <w:sz w:val="24"/>
           <w:szCs w:val="24"/>
         </w:rPr>
-        <w:t xml:space="preserve">一是从“自嘲”滑向“自弃”。但也有人真把“躺平”当成了放弃努力的理由。我身边就有同学在考研复习遇到瓶颈后，用“反正也卷不过，不如躺平”来安慰自己，最终中途放弃。当“躺平”从情绪宣泄变成行动选择，它就可能消解个人的奋斗意志，让人陷入消极和迷茫。</w:t>
+        <w:t xml:space="preserve">一是从“自嘲”滑向“自弃”。但也有人真把“躺平”当成了放弃努力的理由。我身边就有同学在考研复习遇到瓶颈后，用“反正也卷不过，不如躺平”来安慰自己，最终中途放弃。后来他跟我说，那段时间最让他动摇的，是每次刷到“躺平”视频时那种“原来大家都这样”的安慰。当“躺平”从情绪宣泄变成行动选择，它就可能消解个人的奋斗意志，让人陷入消极和迷茫。</w:t>
       </w:r>
     </w:p>
     <w:p>
@@ -566,7 +566,7 @@
           <w:sz w:val="24"/>
           <w:szCs w:val="24"/>
         </w:rPr>
-        <w:t xml:space="preserve">我曾试着在常用的短视频软件里关闭“个性化推荐”。关闭之前，首页几乎被渲染考研失败、大厂裁员和鼓吹裸辞隐居的视频占满，很容易让人觉得全世界不是在崩溃就是在躺平；关闭之后，内容杂了一些，我却重新看到了同龄人多样、具体也更坚韧的生活。平台不能只是被动地给一个开关，还应主动让推荐内容更多样，别把用户困在单一的情绪里。</w:t>
+        <w:t xml:space="preserve">我曾试着在常用的短视频软件里关闭“个性化推荐”。关闭之前，首页几乎被渲染考研失败、大厂裁员和鼓吹裸辞隐居的视频占满，很容易让人觉得全世界不是在崩溃就是在躺平，我每次刷完都莫名心慌；关闭之后，内容杂了一些，我却重新看到了同龄人多样、具体也更坚韧的生活，有人边打工边备考，有人回县城开了家小店。看着这些，我心里反而踏实了不少。平台不能只是被动地给一个开关，还应主动让推荐内容更多样，别把用户困在单一的情绪里。</w:t>
       </w:r>
     </w:p>
     <w:p>

</xml_diff>